<commit_message>
docs: Add archivos pendientes del corpus (guia_tarea2, G9 PDF, C2)
- campo_electrico: guia_tarea2.tex y su imagen TKA8KA05.bmp.
- campo_magnetico: Solucion_G9_P2_P3_P4_P13.pdf.
- evaluaciones/2026/C2: c2_p3_uniforme.pdf y Problema_Gauss.docx
  actualizado.

Co-Authored-By: Claude Opus 5.5 <noreply@anthropic.com>
</commit_message>
<xml_diff>
--- a/corpus/evaluaciones/2026/C2/Problema_Gauss.docx
+++ b/corpus/evaluaciones/2026/C2/Problema_Gauss.docx
@@ -709,99 +709,6 @@
     <w:p>
       <w:pPr>
         <w:jc w:val="both"/>
-      </w:pPr>
-    </w:p>
-    <w:p>
-      <w:pPr>
-        <w:jc w:val="both"/>
-      </w:pPr>
-      <w:r>
-        <w:br/>
-      </w:r>
-    </w:p>
-    <w:p>
-      <w:pPr>
-        <w:jc w:val="both"/>
-      </w:pPr>
-    </w:p>
-    <w:p>
-      <w:pPr>
-        <w:jc w:val="both"/>
-      </w:pPr>
-    </w:p>
-    <w:p>
-      <w:pPr>
-        <w:jc w:val="both"/>
-      </w:pPr>
-    </w:p>
-    <w:p>
-      <w:pPr>
-        <w:jc w:val="both"/>
-      </w:pPr>
-    </w:p>
-    <w:p>
-      <w:pPr>
-        <w:jc w:val="both"/>
-      </w:pPr>
-    </w:p>
-    <w:p>
-      <w:pPr>
-        <w:jc w:val="both"/>
-      </w:pPr>
-    </w:p>
-    <w:p>
-      <w:pPr>
-        <w:jc w:val="both"/>
-      </w:pPr>
-    </w:p>
-    <w:p>
-      <w:pPr>
-        <w:jc w:val="both"/>
-      </w:pPr>
-    </w:p>
-    <w:p>
-      <w:pPr>
-        <w:jc w:val="both"/>
-      </w:pPr>
-    </w:p>
-    <w:p>
-      <w:pPr>
-        <w:jc w:val="both"/>
-      </w:pPr>
-    </w:p>
-    <w:p>
-      <w:pPr>
-        <w:jc w:val="both"/>
-      </w:pPr>
-    </w:p>
-    <w:p>
-      <w:pPr>
-        <w:jc w:val="both"/>
-      </w:pPr>
-    </w:p>
-    <w:p>
-      <w:pPr>
-        <w:jc w:val="both"/>
-      </w:pPr>
-    </w:p>
-    <w:p>
-      <w:pPr>
-        <w:jc w:val="both"/>
-      </w:pPr>
-    </w:p>
-    <w:p>
-      <w:pPr>
-        <w:jc w:val="both"/>
-      </w:pPr>
-    </w:p>
-    <w:p>
-      <w:pPr>
-        <w:jc w:val="both"/>
-      </w:pPr>
-    </w:p>
-    <w:p>
-      <w:pPr>
-        <w:jc w:val="both"/>
         <w:rPr>
           <w:b/>
           <w:bCs/>
@@ -812,7 +719,6 @@
           <w:b/>
           <w:bCs/>
         </w:rPr>
-        <w:lastRenderedPageBreak/>
         <w:t>R</w:t>
       </w:r>
       <w:r>
@@ -2442,6 +2348,7 @@
           <w:noProof/>
           <w14:ligatures w14:val="standardContextual"/>
         </w:rPr>
+        <w:lastRenderedPageBreak/>
         <w:br/>
       </w:r>
       <w:r>
@@ -3592,7 +3499,6 @@
             <w:rPr>
               <w:rFonts w:ascii="Cambria Math" w:hAnsi="Cambria Math"/>
             </w:rPr>
-            <w:lastRenderedPageBreak/>
             <m:t>⟹E</m:t>
           </m:r>
           <m:d>
@@ -4678,103 +4584,14 @@
         <w:jc w:val="both"/>
       </w:pPr>
     </w:p>
+    <w:p/>
     <w:p>
-      <w:pPr>
-        <w:jc w:val="both"/>
-      </w:pPr>
-    </w:p>
-    <w:p>
-      <w:pPr>
-        <w:jc w:val="both"/>
-      </w:pPr>
-    </w:p>
-    <w:p>
-      <w:pPr>
-        <w:jc w:val="both"/>
-      </w:pPr>
-    </w:p>
-    <w:p>
-      <w:pPr>
-        <w:jc w:val="both"/>
-      </w:pPr>
-    </w:p>
-    <w:p>
-      <w:pPr>
-        <w:jc w:val="both"/>
-      </w:pPr>
-    </w:p>
-    <w:p>
-      <w:pPr>
-        <w:jc w:val="both"/>
-      </w:pPr>
-    </w:p>
-    <w:p>
-      <w:pPr>
-        <w:jc w:val="both"/>
-      </w:pPr>
-    </w:p>
-    <w:p>
-      <w:pPr>
-        <w:jc w:val="both"/>
-      </w:pPr>
-    </w:p>
-    <w:p>
-      <w:pPr>
-        <w:jc w:val="both"/>
-      </w:pPr>
-    </w:p>
-    <w:p>
-      <w:pPr>
-        <w:jc w:val="both"/>
-      </w:pPr>
-    </w:p>
-    <w:p>
-      <w:pPr>
-        <w:jc w:val="both"/>
-      </w:pPr>
-    </w:p>
-    <w:p>
-      <w:pPr>
-        <w:jc w:val="both"/>
-      </w:pPr>
-    </w:p>
-    <w:p>
-      <w:pPr>
-        <w:jc w:val="both"/>
-      </w:pPr>
-    </w:p>
-    <w:p>
-      <w:pPr>
-        <w:jc w:val="both"/>
-      </w:pPr>
-    </w:p>
-    <w:p>
-      <w:pPr>
-        <w:jc w:val="both"/>
-      </w:pPr>
-    </w:p>
-    <w:p>
-      <w:pPr>
-        <w:jc w:val="both"/>
-      </w:pPr>
-    </w:p>
-    <w:p>
-      <w:pPr>
-        <w:jc w:val="both"/>
-      </w:pPr>
-    </w:p>
-    <w:p>
-      <w:pPr>
-        <w:jc w:val="both"/>
-      </w:pPr>
-    </w:p>
-    <w:p>
+      <w:bookmarkStart w:id="0" w:name="_GoBack"/>
+      <w:bookmarkEnd w:id="0"/>
       <w:r>
         <w:lastRenderedPageBreak/>
         <w:t>FORMA B</w:t>
       </w:r>
-      <w:bookmarkStart w:id="0" w:name="_GoBack"/>
-      <w:bookmarkEnd w:id="0"/>
     </w:p>
     <w:p>
       <w:pPr>
@@ -5477,7 +5294,6 @@
           <w:bCs/>
           <w:color w:val="000000"/>
         </w:rPr>
-        <w:lastRenderedPageBreak/>
         <w:t>RESPUESTA:</w:t>
       </w:r>
     </w:p>
@@ -5532,6 +5348,7 @@
         <w:rPr>
           <w:color w:val="000000"/>
         </w:rPr>
+        <w:lastRenderedPageBreak/>
         <w:t>Como el cilindro interior es </w:t>
       </w:r>
       <w:r>
@@ -8283,7 +8100,6 @@
         <w:rPr>
           <w:color w:val="000000"/>
         </w:rPr>
-        <w:lastRenderedPageBreak/>
         <w:t>Repitiendo (b), Aplicamos Gauss:</w:t>
       </w:r>
     </w:p>
@@ -8922,6 +8738,7 @@
           <w:bCs/>
           <w:color w:val="000000"/>
         </w:rPr>
+        <w:lastRenderedPageBreak/>
         <w:t>(d) Región </w:t>
       </w:r>
       <m:oMath>
@@ -9473,7 +9290,7 @@
       </w:pPr>
     </w:p>
     <w:sectPr>
-      <w:pgSz w:w="11906" w:h="16838"/>
+      <w:pgSz w:w="12242" w:h="18722" w:code="119"/>
       <w:pgMar w:top="1417" w:right="1701" w:bottom="1417" w:left="1701" w:header="708" w:footer="708" w:gutter="0"/>
       <w:cols w:space="708"/>
       <w:docGrid w:linePitch="360"/>
@@ -11341,6 +11158,36 @@
       <w:color w:val="666666"/>
     </w:rPr>
   </w:style>
+  <w:style w:type="paragraph" w:styleId="Textodeglobo">
+    <w:name w:val="Balloon Text"/>
+    <w:basedOn w:val="Normal"/>
+    <w:link w:val="TextodegloboCar"/>
+    <w:uiPriority w:val="99"/>
+    <w:semiHidden/>
+    <w:unhideWhenUsed/>
+    <w:rsid w:val="008A6F0F"/>
+    <w:rPr>
+      <w:rFonts w:ascii="Segoe UI" w:hAnsi="Segoe UI" w:cs="Segoe UI"/>
+      <w:sz w:val="18"/>
+      <w:szCs w:val="18"/>
+    </w:rPr>
+  </w:style>
+  <w:style w:type="character" w:customStyle="1" w:styleId="TextodegloboCar">
+    <w:name w:val="Texto de globo Car"/>
+    <w:basedOn w:val="Fuentedeprrafopredeter"/>
+    <w:link w:val="Textodeglobo"/>
+    <w:uiPriority w:val="99"/>
+    <w:semiHidden/>
+    <w:rsid w:val="008A6F0F"/>
+    <w:rPr>
+      <w:rFonts w:ascii="Segoe UI" w:eastAsia="Times New Roman" w:hAnsi="Segoe UI" w:cs="Segoe UI"/>
+      <w:kern w:val="0"/>
+      <w:sz w:val="18"/>
+      <w:szCs w:val="18"/>
+      <w:lang w:eastAsia="es-ES_tradnl"/>
+      <w14:ligatures w14:val="none"/>
+    </w:rPr>
+  </w:style>
 </w:styles>
 </file>
 

</xml_diff>